<commit_message>
Apply paper v3 directly to docx binaries: GP section 9 + changelog, sync Zenodo kit
Section 9 (Gross-Pitaevskii cross-PDE) inserted into AlienX 2D.docx with
Conclusion renumbered to 10 and a v2->v3 changelog appended; both 3D docx
(main + Zenodo kit) received the cross-PDE status note and future-work
update. Kit checksums regenerated; docx re-verified by text extraction.
</commit_message>
<xml_diff>
--- a/AlienX 2D.docx
+++ b/AlienX 2D.docx
@@ -6754,17 +6754,259 @@
       <w:r/>
     </w:p>
     <w:p>
-      <w:pPr>
-        <w:spacing w:line="240" w:lineRule="auto" w:after="0" w:before="0"/>
-        <w:ind w:right="0" w:left="0"/>
-      </w:pPr>
-      <w:r>
-        <w:rPr>
-          <w:rFonts w:ascii="Arial" w:hAnsi="Arial" w:cs="Arial" w:eastAsia="Arial"/>
-          <w:color w:val="252525"/>
-          <w:sz w:val="86"/>
-        </w:rPr>
-        <w:t>9. Conclusion</w:t>
+      <w:r>
+        <w:rPr>
+          <w:b/>
+          <w:i w:val="0"/>
+        </w:rPr>
+        <w:t>9. Generality: Cross-PDE Demonstration — Gross-Pitaevskii</w:t>
+      </w:r>
+    </w:p>
+    <w:p>
+      <w:r>
+        <w:rPr>
+          <w:b w:val="0"/>
+          <w:i w:val="0"/>
+        </w:rPr>
+      </w:r>
+    </w:p>
+    <w:p>
+      <w:r>
+        <w:rPr>
+          <w:b w:val="0"/>
+          <w:i w:val="0"/>
+        </w:rPr>
+        <w:t>The architecture is PDE-agnostic: only the outer shell changes. To move from Darcy flow to the 2D Gross-Pitaevskii equation (focusing, split-step Fourier ground truth), the substitutions are: scalar field k = |ψ|², vector inputs ∇k plus the local-frame projections of ∇ψr, ∇ψi, regime parameter g (interaction strength), invariant ∫|ψ|² = 1, and complex-valued output ψ(t+Δt) as a (ΔRe, ΔIm) head. The frame, stencil, harmonic gate, and training protocol are unchanged.</w:t>
+      </w:r>
+    </w:p>
+    <w:p>
+      <w:r>
+        <w:rPr>
+          <w:b w:val="0"/>
+          <w:i w:val="0"/>
+        </w:rPr>
+      </w:r>
+    </w:p>
+    <w:p>
+      <w:r>
+        <w:rPr>
+          <w:b w:val="0"/>
+          <w:i w:val="0"/>
+        </w:rPr>
+        <w:t>Motivation (stated in the 3D paper, §10): the wave function ψ is natively complex, and the ISN harmonic machinery already operates on complex features — whereas conventional operators must split ψ into two real channels and lose phase information in the process. Gross-Pitaevskii is the test where that native complexity should pay off.</w:t>
+      </w:r>
+    </w:p>
+    <w:p>
+      <w:r>
+        <w:rPr>
+          <w:b w:val="0"/>
+          <w:i w:val="0"/>
+        </w:rPr>
+      </w:r>
+    </w:p>
+    <w:p>
+      <w:r>
+        <w:rPr>
+          <w:b w:val="0"/>
+          <w:i w:val="0"/>
+        </w:rPr>
+        <w:t>Two runs, two complementary claims (416,150 parameters each; all numbers are single-step, interior, relative RMSE):</w:t>
+      </w:r>
+    </w:p>
+    <w:p>
+      <w:r>
+        <w:rPr>
+          <w:b w:val="0"/>
+          <w:i w:val="0"/>
+        </w:rPr>
+      </w:r>
+    </w:p>
+    <w:p>
+      <w:r>
+        <w:rPr>
+          <w:b w:val="0"/>
+          <w:i w:val="0"/>
+        </w:rPr>
+        <w:t>Claim                    Run A — precision / invariance      Run B — generalization</w:t>
+      </w:r>
+    </w:p>
+    <w:p>
+      <w:r>
+        <w:rPr>
+          <w:b w:val="0"/>
+          <w:i w:val="0"/>
+        </w:rPr>
+        <w:t>Training                 300 epochs, single-step,             200 epochs, K-curriculum 1→3→5,</w:t>
+      </w:r>
+    </w:p>
+    <w:p>
+      <w:r>
+        <w:rPr>
+          <w:b w:val="0"/>
+          <w:i w:val="0"/>
+        </w:rPr>
+        <w:t xml:space="preserve">                         fixed IC family                      randomized ICs</w:t>
+      </w:r>
+    </w:p>
+    <w:p>
+      <w:r>
+        <w:rPr>
+          <w:b w:val="0"/>
+          <w:i w:val="0"/>
+        </w:rPr>
+        <w:t>Wall time (T4)           11.2 min                             91.5 min</w:t>
+      </w:r>
+    </w:p>
+    <w:p>
+      <w:r>
+        <w:rPr>
+          <w:b w:val="0"/>
+          <w:i w:val="0"/>
+        </w:rPr>
+        <w:t>Eval RelRMSE             0.3439%                              1.0686% ± 0.2052% (16 unseen ICs)</w:t>
+      </w:r>
+    </w:p>
+    <w:p>
+      <w:r>
+        <w:rPr>
+          <w:b w:val="0"/>
+          <w:i w:val="0"/>
+        </w:rPr>
+        <w:t>Phase ablation           108.58× MSE degradation              61.4× MSE degradation</w:t>
+      </w:r>
+    </w:p>
+    <w:p>
+      <w:r>
+        <w:rPr>
+          <w:b w:val="0"/>
+          <w:i w:val="0"/>
+        </w:rPr>
+        <w:t>Rotation sweep (24)      0.4080% ± 0.0315%                    1.0347% ± 0.0806%</w:t>
+      </w:r>
+    </w:p>
+    <w:p>
+      <w:r>
+        <w:rPr>
+          <w:b w:val="0"/>
+          <w:i w:val="0"/>
+        </w:rPr>
+        <w:t>Multi-g (−0.5/−1.0/−2.0) 0.344–0.362%                         1.044–1.051%</w:t>
+      </w:r>
+    </w:p>
+    <w:p>
+      <w:r>
+        <w:rPr>
+          <w:b w:val="0"/>
+          <w:i w:val="0"/>
+        </w:rPr>
+        <w:t>Scale, zero-shot         16→256: 0.324–0.367%                 16→256: 1.05–1.10%</w:t>
+      </w:r>
+    </w:p>
+    <w:p>
+      <w:r>
+        <w:rPr>
+          <w:b w:val="0"/>
+          <w:i w:val="0"/>
+        </w:rPr>
+      </w:r>
+    </w:p>
+    <w:p>
+      <w:r>
+        <w:rPr>
+          <w:b w:val="0"/>
+          <w:i w:val="0"/>
+        </w:rPr>
+        <w:t>Run A's IC generator is deterministic (fixed phase coefficients; only rotation varies), so its seed-spread is 0.0000% by construction — it is a mechanism-precision result, not an IC-generalization result. Run B carries the generalization claim. The two claims are kept separate deliberately.</w:t>
+      </w:r>
+    </w:p>
+    <w:p>
+      <w:r>
+        <w:rPr>
+          <w:b w:val="0"/>
+          <w:i w:val="0"/>
+        </w:rPr>
+      </w:r>
+    </w:p>
+    <w:p>
+      <w:r>
+        <w:rPr>
+          <w:b w:val="0"/>
+          <w:i w:val="0"/>
+        </w:rPr>
+        <w:t>Fix arc: the first GP implementation plateaued at 0.056 loss. Two fixes — even-harmonic edge features (cos 2θ, sin 2θ) and taking the frame source as k = |ψ|² rather than |ψ|²·|∇arg ψ|² — brought the loss to 0.000004, a 14× improvement. The ablation ratios above independently confirm the harmonic gate as the load-bearing component.</w:t>
+      </w:r>
+    </w:p>
+    <w:p>
+      <w:r>
+        <w:rPr>
+          <w:b w:val="0"/>
+          <w:i w:val="0"/>
+        </w:rPr>
+      </w:r>
+    </w:p>
+    <w:p>
+      <w:r>
+        <w:rPr>
+          <w:b w:val="0"/>
+          <w:i w:val="0"/>
+        </w:rPr>
+        <w:t>Verdict: the phase mechanism is load-bearing on quantum hydrodynamics exactly as the architecture's design predicts, and the operator transfers across PDEs with only the outer shell changing. The 3D GP run remains the next step.</w:t>
+      </w:r>
+    </w:p>
+    <w:p>
+      <w:r>
+        <w:rPr>
+          <w:b w:val="0"/>
+          <w:i w:val="0"/>
+        </w:rPr>
+      </w:r>
+    </w:p>
+    <w:p>
+      <w:r>
+        <w:rPr>
+          <w:b w:val="0"/>
+          <w:i w:val="0"/>
+        </w:rPr>
+        <w:t>Code availability: 'AlienX 2D × GP/' in the release — both training scripts, both evaluation suites, and raw logs for every number above.</w:t>
+      </w:r>
+    </w:p>
+    <w:p>
+      <w:r>
+        <w:rPr>
+          <w:b w:val="0"/>
+          <w:i w:val="0"/>
+        </w:rPr>
+      </w:r>
+    </w:p>
+    <w:p>
+      <w:r>
+        <w:rPr>
+          <w:b w:val="0"/>
+          <w:i w:val="0"/>
+        </w:rPr>
+        <w:t>---</w:t>
+      </w:r>
+    </w:p>
+    <w:p>
+      <w:r>
+        <w:rPr>
+          <w:b w:val="0"/>
+          <w:i w:val="0"/>
+        </w:rPr>
+      </w:r>
+    </w:p>
+    <w:p>
+      <w:pPr>
+        <w:spacing w:line="240" w:lineRule="auto" w:after="0" w:before="0"/>
+        <w:ind w:right="0" w:left="0"/>
+      </w:pPr>
+      <w:r>
+        <w:rPr>
+          <w:rFonts w:ascii="Arial" w:hAnsi="Arial" w:cs="Arial" w:eastAsia="Arial"/>
+          <w:color w:val="252525"/>
+          <w:sz w:val="86"/>
+        </w:rPr>
+        <w:t>10. Conclusion</w:t>
       </w:r>
     </w:p>
     <w:p>
@@ -7133,6 +7375,67 @@
           <w:sz w:val="86"/>
         </w:rPr>
         <w:t>Everything else — every code block, every section, every paragraph, every bullet — unchanged.</w:t>
+      </w:r>
+    </w:p>
+    <w:p>
+      <w:r>
+        <w:rPr>
+          <w:b/>
+          <w:i w:val="0"/>
+        </w:rPr>
+        <w:t>Changed from v2:</w:t>
+      </w:r>
+    </w:p>
+    <w:p>
+      <w:r>
+        <w:rPr>
+          <w:b w:val="0"/>
+          <w:i w:val="0"/>
+        </w:rPr>
+      </w:r>
+    </w:p>
+    <w:p>
+      <w:r>
+        <w:rPr>
+          <w:b w:val="0"/>
+          <w:i w:val="0"/>
+        </w:rPr>
+        <w:t>Location                       v2                                  v3</w:t>
+      </w:r>
+    </w:p>
+    <w:p>
+      <w:r>
+        <w:rPr>
+          <w:b w:val="0"/>
+          <w:i w:val="0"/>
+        </w:rPr>
+        <w:t>§9 (new)                       —                                   Generality: Cross-PDE Demonstration — Gross-Pitaevskii (two-run table, fix arc, verdict)</w:t>
+      </w:r>
+    </w:p>
+    <w:p>
+      <w:r>
+        <w:rPr>
+          <w:b w:val="0"/>
+          <w:i w:val="0"/>
+        </w:rPr>
+        <w:t>§10                            was §9 Conclusion                   renumbered only; text unchanged</w:t>
+      </w:r>
+    </w:p>
+    <w:p>
+      <w:r>
+        <w:rPr>
+          <w:b w:val="0"/>
+          <w:i w:val="0"/>
+        </w:rPr>
+      </w:r>
+    </w:p>
+    <w:p>
+      <w:r>
+        <w:rPr>
+          <w:b w:val="0"/>
+          <w:i w:val="0"/>
+        </w:rPr>
+        <w:t>Everything from v2 — every code block, every table, every debugging entry — unchanged.</w:t>
       </w:r>
     </w:p>
     <w:sectPr>

</xml_diff>

<commit_message>
Paper v3.1: arXiv-style front matter + Figures 1-3 embedded (md, docx, kits)
Numbered figure set: Darcy rotation sweep (Fig 1, end of Results), Dark
Necromancer training graph (Fig 2, after Run B table), GP field rollout
comparison (Fig 3, after fix arc). Added author/subjects/keywords block,
version history, contents line; changelogs demoted to Appendix A. Figures
embedded into the Word paper as well; synced to HF card and Zenodo kit
(checksums refreshed, 29 files).
</commit_message>
<xml_diff>
--- a/AlienX 2D.docx
+++ b/AlienX 2D.docx
@@ -5914,6 +5914,57 @@
     </w:p>
     <w:p>
       <w:pPr>
+        <w:jc w:val="center"/>
+      </w:pPr>
+      <w:r>
+        <w:drawing>
+          <wp:inline xmlns:wp="http://schemas.openxmlformats.org/drawingml/2006/wordprocessingDrawing" xmlns:a="http://schemas.openxmlformats.org/drawingml/2006/main" xmlns:pic="http://schemas.openxmlformats.org/drawingml/2006/picture" xmlns:r="http://schemas.openxmlformats.org/officeDocument/2006/relationships">
+            <wp:extent cx="5943600" cy="2971800"/>
+            <wp:docPr id="1" name="Picture 1"/>
+            <wp:cNvGraphicFramePr>
+              <a:graphicFrameLocks noChangeAspect="1"/>
+            </wp:cNvGraphicFramePr>
+            <a:graphic>
+              <a:graphicData uri="http://schemas.openxmlformats.org/drawingml/2006/picture">
+                <pic:pic>
+                  <pic:nvPicPr>
+                    <pic:cNvPr id="0" name="alienx_v2_rotation_sweep.png"/>
+                    <pic:cNvPicPr/>
+                  </pic:nvPicPr>
+                  <pic:blipFill>
+                    <a:blip r:embed="rId2"/>
+                    <a:stretch>
+                      <a:fillRect/>
+                    </a:stretch>
+                  </pic:blipFill>
+                  <pic:spPr>
+                    <a:xfrm>
+                      <a:off x="0" y="0"/>
+                      <a:ext cx="5943600" cy="2971800"/>
+                    </a:xfrm>
+                    <a:prstGeom prst="rect"/>
+                  </pic:spPr>
+                </pic:pic>
+              </a:graphicData>
+            </a:graphic>
+          </wp:inline>
+        </w:drawing>
+      </w:r>
+    </w:p>
+    <w:p>
+      <w:pPr>
+        <w:jc w:val="center"/>
+      </w:pPr>
+      <w:r>
+        <w:rPr>
+          <w:i/>
+          <w:sz w:val="18"/>
+        </w:rPr>
+        <w:t>Figure 1: Darcy-flow rotation sweep — interior L1 error vs rotation angle. The isotropic 24-neighbor stencil removes the 45° residual of earlier 8-directional stencils; error stays flat across the full circle.</w:t>
+      </w:r>
+    </w:p>
+    <w:p>
+      <w:pPr>
         <w:spacing w:line="240" w:lineRule="auto" w:after="0" w:before="0"/>
         <w:ind w:right="0" w:left="0"/>
       </w:pPr>
@@ -6903,6 +6954,57 @@
       </w:r>
     </w:p>
     <w:p>
+      <w:pPr>
+        <w:jc w:val="center"/>
+      </w:pPr>
+      <w:r>
+        <w:drawing>
+          <wp:inline xmlns:wp="http://schemas.openxmlformats.org/drawingml/2006/wordprocessingDrawing" xmlns:a="http://schemas.openxmlformats.org/drawingml/2006/main" xmlns:pic="http://schemas.openxmlformats.org/drawingml/2006/picture" xmlns:r="http://schemas.openxmlformats.org/officeDocument/2006/relationships">
+            <wp:extent cx="5303520" cy="3788229"/>
+            <wp:docPr id="2" name="Picture 2"/>
+            <wp:cNvGraphicFramePr>
+              <a:graphicFrameLocks noChangeAspect="1"/>
+            </wp:cNvGraphicFramePr>
+            <a:graphic>
+              <a:graphicData uri="http://schemas.openxmlformats.org/drawingml/2006/picture">
+                <pic:pic>
+                  <pic:nvPicPr>
+                    <pic:cNvPr id="0" name="dark_necromancer_graph_gp.png"/>
+                    <pic:cNvPicPr/>
+                  </pic:nvPicPr>
+                  <pic:blipFill>
+                    <a:blip r:embed="rId3"/>
+                    <a:stretch>
+                      <a:fillRect/>
+                    </a:stretch>
+                  </pic:blipFill>
+                  <pic:spPr>
+                    <a:xfrm>
+                      <a:off x="0" y="0"/>
+                      <a:ext cx="5303520" cy="3788229"/>
+                    </a:xfrm>
+                    <a:prstGeom prst="rect"/>
+                  </pic:spPr>
+                </pic:pic>
+              </a:graphicData>
+            </a:graphic>
+          </wp:inline>
+        </w:drawing>
+      </w:r>
+    </w:p>
+    <w:p>
+      <w:pPr>
+        <w:jc w:val="center"/>
+      </w:pPr>
+      <w:r>
+        <w:rPr>
+          <w:i/>
+          <w:sz w:val="18"/>
+        </w:rPr>
+        <w:t>Figure 2: Dark Necromancer Graph — Run B training diagnostics. Panels: loss curves (train/val), validation RelRMSE, learning-rate schedule, K-unroll curriculum 1→3→5. 200 epochs, 91.5 min on a single T4.</w:t>
+      </w:r>
+    </w:p>
+    <w:p>
       <w:r>
         <w:rPr>
           <w:b w:val="0"/>
@@ -6934,6 +7036,57 @@
           <w:i w:val="0"/>
         </w:rPr>
         <w:t>Fix arc: the first GP implementation plateaued at 0.056 loss. Two fixes — even-harmonic edge features (cos 2θ, sin 2θ) and taking the frame source as k = |ψ|² rather than |ψ|²·|∇arg ψ|² — brought the loss to 0.000004, a 14× improvement. The ablation ratios above independently confirm the harmonic gate as the load-bearing component.</w:t>
+      </w:r>
+    </w:p>
+    <w:p>
+      <w:pPr>
+        <w:jc w:val="center"/>
+      </w:pPr>
+      <w:r>
+        <w:drawing>
+          <wp:inline xmlns:wp="http://schemas.openxmlformats.org/drawingml/2006/wordprocessingDrawing" xmlns:a="http://schemas.openxmlformats.org/drawingml/2006/main" xmlns:pic="http://schemas.openxmlformats.org/drawingml/2006/picture" xmlns:r="http://schemas.openxmlformats.org/officeDocument/2006/relationships">
+            <wp:extent cx="5943600" cy="1981200"/>
+            <wp:docPr id="3" name="Picture 3"/>
+            <wp:cNvGraphicFramePr>
+              <a:graphicFrameLocks noChangeAspect="1"/>
+            </wp:cNvGraphicFramePr>
+            <a:graphic>
+              <a:graphicData uri="http://schemas.openxmlformats.org/drawingml/2006/picture">
+                <pic:pic>
+                  <pic:nvPicPr>
+                    <pic:cNvPr id="0" name="dark_field_rollout_gp.png"/>
+                    <pic:cNvPicPr/>
+                  </pic:nvPicPr>
+                  <pic:blipFill>
+                    <a:blip r:embed="rId4"/>
+                    <a:stretch>
+                      <a:fillRect/>
+                    </a:stretch>
+                  </pic:blipFill>
+                  <pic:spPr>
+                    <a:xfrm>
+                      <a:off x="0" y="0"/>
+                      <a:ext cx="5943600" cy="1981200"/>
+                    </a:xfrm>
+                    <a:prstGeom prst="rect"/>
+                  </pic:spPr>
+                </pic:pic>
+              </a:graphicData>
+            </a:graphic>
+          </wp:inline>
+        </w:drawing>
+      </w:r>
+    </w:p>
+    <w:p>
+      <w:pPr>
+        <w:jc w:val="center"/>
+      </w:pPr>
+      <w:r>
+        <w:rPr>
+          <w:i/>
+          <w:sz w:val="18"/>
+        </w:rPr>
+        <w:t>Figure 3: Rollout comparison on an unseen IC (N=64, g=−1.0, Δt=2×10⁻³). Top row: split-step Fourier ground truth |ψ|². Bottom row: AlienX autoregressive rollout, five consecutive single-step predictions (t = 0 → 0.010).</w:t>
       </w:r>
     </w:p>
     <w:p>

</xml_diff>